<commit_message>
docs(presentation): add Ronald M. Barril to group and assign 4-presenter rotation to script
</commit_message>
<xml_diff>
--- a/TPoliCynav_Final_Presentation_Script.docx
+++ b/TPoliCynav_Final_Presentation_Script.docx
@@ -39,9 +39,9 @@
           <w:rFonts w:ascii="Calibri" w:hAnsi="Calibri"/>
           <w:i/>
           <w:color w:val="64748B"/>
-          <w:sz w:val="24"/>
+          <w:sz w:val="23"/>
         </w:rPr>
-        <w:t>Official 5-to-8 Minute Video Recording Guide based on final_presentation_guide.pdf</w:t>
+        <w:t>Official 5-to-8 Minute Video Recording Guide with Assigned Speaker Roles (final_presentation_guide.pdf)</w:t>
       </w:r>
     </w:p>
     <w:tbl>
@@ -184,7 +184,7 @@
                 <w:color w:val="064E3B"/>
                 <w:sz w:val="19"/>
               </w:rPr>
-              <w:t>Capstone Team</w:t>
+              <w:t>Capstone Group (Team Kuys)</w:t>
             </w:r>
           </w:p>
         </w:tc>
@@ -209,7 +209,7 @@
                 <w:color w:val="0F172A"/>
                 <w:sz w:val="19"/>
               </w:rPr>
-              <w:t>Team Kuys: Eduardo Avenido Jr. • Christian Paul Larosa • Nielbert Garcia • Marcel Avergonzado</w:t>
+              <w:t>Eduardo Avenido Jr. • Christian Paul G. La Rosa • Nielbert Garcia • Marcel Avergonzado • Ronald M. Barril</w:t>
             </w:r>
           </w:p>
         </w:tc>
@@ -237,7 +237,7 @@
                 <w:color w:val="064E3B"/>
                 <w:sz w:val="19"/>
               </w:rPr>
-              <w:t>Target Video Length</w:t>
+              <w:t>System Creator &amp; Architect</w:t>
             </w:r>
           </w:p>
         </w:tc>
@@ -262,7 +262,7 @@
                 <w:color w:val="0F172A"/>
                 <w:sz w:val="19"/>
               </w:rPr>
-              <w:t>5 to 8 Minutes (Structured directly to meet 100/100 Rubric Points)</w:t>
+              <w:t>Christian Paul G. La Rosa (Lead AI &amp; System Developer — Creator of TPoliCynav)</w:t>
             </w:r>
           </w:p>
         </w:tc>
@@ -290,7 +290,7 @@
                 <w:color w:val="064E3B"/>
                 <w:sz w:val="19"/>
               </w:rPr>
-              <w:t>Live Deployed App URL</w:t>
+              <w:t>Assigned Video Presenters</w:t>
             </w:r>
           </w:p>
         </w:tc>
@@ -315,7 +315,7 @@
                 <w:color w:val="0F172A"/>
                 <w:sz w:val="19"/>
               </w:rPr>
-              <w:t>https://tpolicynav-production.up.railway.app (Public, Zero-Login Required)</w:t>
+              <w:t>1. Eduardo Avenido Jr.  |  2. Nielbert Garcia  |  3. Marcel Avergonzado  |  4. Ronald M. Barril</w:t>
             </w:r>
           </w:p>
         </w:tc>
@@ -343,6 +343,59 @@
                 <w:color w:val="064E3B"/>
                 <w:sz w:val="19"/>
               </w:rPr>
+              <w:t>Live Deployed App URL</w:t>
+            </w:r>
+          </w:p>
+        </w:tc>
+        <w:tc>
+          <w:tcPr>
+            <w:tcW w:type="dxa" w:w="6192"/>
+            <w:shd w:fill="FFFFFF"/>
+            <w:tcMar>
+              <w:top w:w="70" w:type="dxa"/>
+              <w:bottom w:w="70" w:type="dxa"/>
+              <w:left w:w="100" w:type="dxa"/>
+              <w:right w:w="100" w:type="dxa"/>
+            </w:tcMar>
+          </w:tcPr>
+          <w:p>
+            <w:pPr>
+              <w:spacing w:after="0"/>
+            </w:pPr>
+            <w:r>
+              <w:rPr>
+                <w:rFonts w:ascii="Calibri" w:hAnsi="Calibri"/>
+                <w:color w:val="0F172A"/>
+                <w:sz w:val="19"/>
+              </w:rPr>
+              <w:t>https://tpolicynav-production.up.railway.app (Public, Zero-Login Required)</w:t>
+            </w:r>
+          </w:p>
+        </w:tc>
+      </w:tr>
+      <w:tr>
+        <w:tc>
+          <w:tcPr>
+            <w:tcW w:type="dxa" w:w="3168"/>
+            <w:shd w:fill="F8FAFC"/>
+            <w:tcMar>
+              <w:top w:w="70" w:type="dxa"/>
+              <w:bottom w:w="70" w:type="dxa"/>
+              <w:left w:w="100" w:type="dxa"/>
+              <w:right w:w="100" w:type="dxa"/>
+            </w:tcMar>
+          </w:tcPr>
+          <w:p>
+            <w:pPr>
+              <w:spacing w:after="0"/>
+            </w:pPr>
+            <w:r>
+              <w:rPr>
+                <w:rFonts w:ascii="Calibri" w:hAnsi="Calibri"/>
+                <w:b/>
+                <w:color w:val="064E3B"/>
+                <w:sz w:val="19"/>
+              </w:rPr>
               <w:t>Public GitHub Repository</w:t>
             </w:r>
           </w:p>
@@ -350,7 +403,7 @@
         <w:tc>
           <w:tcPr>
             <w:tcW w:type="dxa" w:w="6192"/>
-            <w:shd w:fill="FFFFFF"/>
+            <w:shd w:fill="F8FAFC"/>
             <w:tcMar>
               <w:top w:w="70" w:type="dxa"/>
               <w:bottom w:w="70" w:type="dxa"/>
@@ -388,7 +441,7 @@
           <w:rFonts w:ascii="Calibri" w:hAnsi="Calibri"/>
           <w:color w:val="064E3B"/>
         </w:rPr>
-        <w:t>📋 Video Section Breakdown &amp; Timing Map</w:t>
+        <w:t>📋 Video Section Breakdown &amp; Presenter Rotation</w:t>
       </w:r>
     </w:p>
     <w:p>
@@ -400,7 +453,7 @@
           <w:rFonts w:ascii="Calibri" w:hAnsi="Calibri"/>
           <w:sz w:val="21"/>
         </w:rPr>
-        <w:t>According to the official grading rubric, the demo video must cover 5 parts in exact sequential order. Here is the recommended timing to hit the sweet spot between 5 and 7 minutes:</w:t>
+        <w:t>According to the official grading rubric, the demo video must cover 5 parts in exact sequential order. The speaking roles are distributed across our 4 presenters (Christian Paul G. La Rosa is credited as the system creator):</w:t>
       </w:r>
     </w:p>
     <w:tbl>
@@ -410,20 +463,21 @@
         <w:tblLook w:firstColumn="1" w:firstRow="1" w:lastColumn="0" w:lastRow="0" w:noHBand="0" w:noVBand="1" w:val="04A0"/>
       </w:tblPr>
       <w:tblGrid>
-        <w:gridCol w:w="3120"/>
-        <w:gridCol w:w="3120"/>
-        <w:gridCol w:w="3120"/>
+        <w:gridCol w:w="2340"/>
+        <w:gridCol w:w="2340"/>
+        <w:gridCol w:w="2340"/>
+        <w:gridCol w:w="2340"/>
       </w:tblGrid>
       <w:tr>
         <w:tc>
           <w:tcPr>
-            <w:tcW w:type="dxa" w:w="2592"/>
+            <w:tcW w:type="dxa" w:w="2160"/>
             <w:shd w:fill="E2E8F0"/>
             <w:tcMar>
               <w:top w:w="80" w:type="dxa"/>
               <w:bottom w:w="80" w:type="dxa"/>
-              <w:left w:w="90" w:type="dxa"/>
-              <w:right w:w="90" w:type="dxa"/>
+              <w:left w:w="80" w:type="dxa"/>
+              <w:right w:w="80" w:type="dxa"/>
             </w:tcMar>
           </w:tcPr>
           <w:p>
@@ -435,7 +489,7 @@
                 <w:rFonts w:ascii="Calibri" w:hAnsi="Calibri"/>
                 <w:b/>
                 <w:color w:val="064E3B"/>
-                <w:sz w:val="20"/>
+                <w:sz w:val="19"/>
               </w:rPr>
               <w:t>Part &amp; Order</w:t>
             </w:r>
@@ -443,13 +497,13 @@
         </w:tc>
         <w:tc>
           <w:tcPr>
-            <w:tcW w:type="dxa" w:w="4896"/>
+            <w:tcW w:type="dxa" w:w="2304"/>
             <w:shd w:fill="E2E8F0"/>
             <w:tcMar>
               <w:top w:w="80" w:type="dxa"/>
               <w:bottom w:w="80" w:type="dxa"/>
-              <w:left w:w="90" w:type="dxa"/>
-              <w:right w:w="90" w:type="dxa"/>
+              <w:left w:w="80" w:type="dxa"/>
+              <w:right w:w="80" w:type="dxa"/>
             </w:tcMar>
           </w:tcPr>
           <w:p>
@@ -461,21 +515,21 @@
                 <w:rFonts w:ascii="Calibri" w:hAnsi="Calibri"/>
                 <w:b/>
                 <w:color w:val="064E3B"/>
-                <w:sz w:val="20"/>
+                <w:sz w:val="19"/>
               </w:rPr>
-              <w:t>Required Topic / Content</w:t>
+              <w:t>Assigned Presenter</w:t>
             </w:r>
           </w:p>
         </w:tc>
         <w:tc>
           <w:tcPr>
-            <w:tcW w:type="dxa" w:w="1872"/>
+            <w:tcW w:type="dxa" w:w="3312"/>
             <w:shd w:fill="E2E8F0"/>
             <w:tcMar>
               <w:top w:w="80" w:type="dxa"/>
               <w:bottom w:w="80" w:type="dxa"/>
-              <w:left w:w="90" w:type="dxa"/>
-              <w:right w:w="90" w:type="dxa"/>
+              <w:left w:w="80" w:type="dxa"/>
+              <w:right w:w="80" w:type="dxa"/>
             </w:tcMar>
           </w:tcPr>
           <w:p>
@@ -487,7 +541,33 @@
                 <w:rFonts w:ascii="Calibri" w:hAnsi="Calibri"/>
                 <w:b/>
                 <w:color w:val="064E3B"/>
-                <w:sz w:val="20"/>
+                <w:sz w:val="19"/>
+              </w:rPr>
+              <w:t>Required Topic / Content</w:t>
+            </w:r>
+          </w:p>
+        </w:tc>
+        <w:tc>
+          <w:tcPr>
+            <w:tcW w:type="dxa" w:w="1584"/>
+            <w:shd w:fill="E2E8F0"/>
+            <w:tcMar>
+              <w:top w:w="80" w:type="dxa"/>
+              <w:bottom w:w="80" w:type="dxa"/>
+              <w:left w:w="80" w:type="dxa"/>
+              <w:right w:w="80" w:type="dxa"/>
+            </w:tcMar>
+          </w:tcPr>
+          <w:p>
+            <w:pPr>
+              <w:spacing w:after="0"/>
+            </w:pPr>
+            <w:r>
+              <w:rPr>
+                <w:rFonts w:ascii="Calibri" w:hAnsi="Calibri"/>
+                <w:b/>
+                <w:color w:val="064E3B"/>
+                <w:sz w:val="19"/>
               </w:rPr>
               <w:t>Estimated Duration</w:t>
             </w:r>
@@ -497,13 +577,13 @@
       <w:tr>
         <w:tc>
           <w:tcPr>
-            <w:tcW w:type="dxa" w:w="2592"/>
+            <w:tcW w:type="dxa" w:w="2160"/>
             <w:shd w:fill="FFFFFF"/>
             <w:tcMar>
               <w:top w:w="80" w:type="dxa"/>
               <w:bottom w:w="80" w:type="dxa"/>
-              <w:left w:w="90" w:type="dxa"/>
-              <w:right w:w="90" w:type="dxa"/>
+              <w:left w:w="80" w:type="dxa"/>
+              <w:right w:w="80" w:type="dxa"/>
             </w:tcMar>
           </w:tcPr>
           <w:p>
@@ -514,21 +594,21 @@
               <w:rPr>
                 <w:rFonts w:ascii="Calibri" w:hAnsi="Calibri"/>
                 <w:b w:val="0"/>
-                <w:sz w:val="19"/>
+                <w:sz w:val="18"/>
               </w:rPr>
-              <w:t>Part 1: The Problem &amp; Data</w:t>
+              <w:t>Part 1: Problem &amp; Data</w:t>
             </w:r>
           </w:p>
         </w:tc>
         <w:tc>
           <w:tcPr>
-            <w:tcW w:type="dxa" w:w="4896"/>
+            <w:tcW w:type="dxa" w:w="2304"/>
             <w:shd w:fill="FFFFFF"/>
             <w:tcMar>
               <w:top w:w="80" w:type="dxa"/>
               <w:bottom w:w="80" w:type="dxa"/>
-              <w:left w:w="90" w:type="dxa"/>
-              <w:right w:w="90" w:type="dxa"/>
+              <w:left w:w="80" w:type="dxa"/>
+              <w:right w:w="80" w:type="dxa"/>
             </w:tcMar>
           </w:tcPr>
           <w:p>
@@ -539,21 +619,21 @@
               <w:rPr>
                 <w:rFonts w:ascii="Calibri" w:hAnsi="Calibri"/>
                 <w:b w:val="0"/>
-                <w:sz w:val="19"/>
+                <w:sz w:val="18"/>
               </w:rPr>
-              <w:t>Problem statement &amp; 7 official TPC policy knowledge sources</w:t>
+              <w:t>Eduardo Avenido Jr.</w:t>
             </w:r>
           </w:p>
         </w:tc>
         <w:tc>
           <w:tcPr>
-            <w:tcW w:type="dxa" w:w="1872"/>
+            <w:tcW w:type="dxa" w:w="3312"/>
             <w:shd w:fill="FFFFFF"/>
             <w:tcMar>
               <w:top w:w="80" w:type="dxa"/>
               <w:bottom w:w="80" w:type="dxa"/>
-              <w:left w:w="90" w:type="dxa"/>
-              <w:right w:w="90" w:type="dxa"/>
+              <w:left w:w="80" w:type="dxa"/>
+              <w:right w:w="80" w:type="dxa"/>
             </w:tcMar>
           </w:tcPr>
           <w:p>
@@ -564,23 +644,21 @@
               <w:rPr>
                 <w:rFonts w:ascii="Calibri" w:hAnsi="Calibri"/>
                 <w:b w:val="0"/>
-                <w:sz w:val="19"/>
+                <w:sz w:val="18"/>
               </w:rPr>
-              <w:t>0:00 – 1:15 (1 min 15s)</w:t>
+              <w:t>Team intro, problem statement, 7 official TPC policy sources</w:t>
             </w:r>
           </w:p>
         </w:tc>
-      </w:tr>
-      <w:tr>
         <w:tc>
           <w:tcPr>
-            <w:tcW w:type="dxa" w:w="2592"/>
-            <w:shd w:fill="F8FAFC"/>
+            <w:tcW w:type="dxa" w:w="1584"/>
+            <w:shd w:fill="FFFFFF"/>
             <w:tcMar>
               <w:top w:w="80" w:type="dxa"/>
               <w:bottom w:w="80" w:type="dxa"/>
-              <w:left w:w="90" w:type="dxa"/>
-              <w:right w:w="90" w:type="dxa"/>
+              <w:left w:w="80" w:type="dxa"/>
+              <w:right w:w="80" w:type="dxa"/>
             </w:tcMar>
           </w:tcPr>
           <w:p>
@@ -591,21 +669,23 @@
               <w:rPr>
                 <w:rFonts w:ascii="Calibri" w:hAnsi="Calibri"/>
                 <w:b w:val="0"/>
-                <w:sz w:val="19"/>
+                <w:sz w:val="18"/>
               </w:rPr>
-              <w:t>Part 2: Technical Architecture</w:t>
+              <w:t>0:00 – 1:30 (1m 30s)</w:t>
             </w:r>
           </w:p>
         </w:tc>
+      </w:tr>
+      <w:tr>
         <w:tc>
           <w:tcPr>
-            <w:tcW w:type="dxa" w:w="4896"/>
+            <w:tcW w:type="dxa" w:w="2160"/>
             <w:shd w:fill="F8FAFC"/>
             <w:tcMar>
               <w:top w:w="80" w:type="dxa"/>
               <w:bottom w:w="80" w:type="dxa"/>
-              <w:left w:w="90" w:type="dxa"/>
-              <w:right w:w="90" w:type="dxa"/>
+              <w:left w:w="80" w:type="dxa"/>
+              <w:right w:w="80" w:type="dxa"/>
             </w:tcMar>
           </w:tcPr>
           <w:p>
@@ -616,21 +696,21 @@
               <w:rPr>
                 <w:rFonts w:ascii="Calibri" w:hAnsi="Calibri"/>
                 <w:b w:val="0"/>
-                <w:sz w:val="19"/>
+                <w:sz w:val="18"/>
               </w:rPr>
-              <w:t>Embedding model, Pinecone vector store, LLM, LangChain, guardrail</w:t>
+              <w:t>Part 2: Architecture</w:t>
             </w:r>
           </w:p>
         </w:tc>
         <w:tc>
           <w:tcPr>
-            <w:tcW w:type="dxa" w:w="1872"/>
+            <w:tcW w:type="dxa" w:w="2304"/>
             <w:shd w:fill="F8FAFC"/>
             <w:tcMar>
               <w:top w:w="80" w:type="dxa"/>
               <w:bottom w:w="80" w:type="dxa"/>
-              <w:left w:w="90" w:type="dxa"/>
-              <w:right w:w="90" w:type="dxa"/>
+              <w:left w:w="80" w:type="dxa"/>
+              <w:right w:w="80" w:type="dxa"/>
             </w:tcMar>
           </w:tcPr>
           <w:p>
@@ -641,23 +721,21 @@
               <w:rPr>
                 <w:rFonts w:ascii="Calibri" w:hAnsi="Calibri"/>
                 <w:b w:val="0"/>
-                <w:sz w:val="19"/>
+                <w:sz w:val="18"/>
               </w:rPr>
-              <w:t>1:15 – 2:30 (1 min 15s)</w:t>
+              <w:t>Nielbert Garcia</w:t>
             </w:r>
           </w:p>
         </w:tc>
-      </w:tr>
-      <w:tr>
         <w:tc>
           <w:tcPr>
-            <w:tcW w:type="dxa" w:w="2592"/>
-            <w:shd w:fill="FFFFFF"/>
+            <w:tcW w:type="dxa" w:w="3312"/>
+            <w:shd w:fill="F8FAFC"/>
             <w:tcMar>
               <w:top w:w="80" w:type="dxa"/>
               <w:bottom w:w="80" w:type="dxa"/>
-              <w:left w:w="90" w:type="dxa"/>
-              <w:right w:w="90" w:type="dxa"/>
+              <w:left w:w="80" w:type="dxa"/>
+              <w:right w:w="80" w:type="dxa"/>
             </w:tcMar>
           </w:tcPr>
           <w:p>
@@ -668,21 +746,21 @@
               <w:rPr>
                 <w:rFonts w:ascii="Calibri" w:hAnsi="Calibri"/>
                 <w:b w:val="0"/>
-                <w:sz w:val="19"/>
+                <w:sz w:val="18"/>
               </w:rPr>
-              <w:t>Part 3: Live Public Walkthrough</w:t>
+              <w:t>BGE-Small embedding, Pinecone vector store, 0.50 guardrail, LangChain</w:t>
             </w:r>
           </w:p>
         </w:tc>
         <w:tc>
           <w:tcPr>
-            <w:tcW w:type="dxa" w:w="4896"/>
-            <w:shd w:fill="FFFFFF"/>
+            <w:tcW w:type="dxa" w:w="1584"/>
+            <w:shd w:fill="F8FAFC"/>
             <w:tcMar>
               <w:top w:w="80" w:type="dxa"/>
               <w:bottom w:w="80" w:type="dxa"/>
-              <w:left w:w="90" w:type="dxa"/>
-              <w:right w:w="90" w:type="dxa"/>
+              <w:left w:w="80" w:type="dxa"/>
+              <w:right w:w="80" w:type="dxa"/>
             </w:tcMar>
           </w:tcPr>
           <w:p>
@@ -693,21 +771,23 @@
               <w:rPr>
                 <w:rFonts w:ascii="Calibri" w:hAnsi="Calibri"/>
                 <w:b w:val="0"/>
-                <w:sz w:val="19"/>
+                <w:sz w:val="18"/>
               </w:rPr>
-              <w:t>Public Railway link, zero login, UI layout, masthead, mobile responsiveness</w:t>
+              <w:t>1:30 – 2:45 (1m 15s)</w:t>
             </w:r>
           </w:p>
         </w:tc>
+      </w:tr>
+      <w:tr>
         <w:tc>
           <w:tcPr>
-            <w:tcW w:type="dxa" w:w="1872"/>
+            <w:tcW w:type="dxa" w:w="2160"/>
             <w:shd w:fill="FFFFFF"/>
             <w:tcMar>
               <w:top w:w="80" w:type="dxa"/>
               <w:bottom w:w="80" w:type="dxa"/>
-              <w:left w:w="90" w:type="dxa"/>
-              <w:right w:w="90" w:type="dxa"/>
+              <w:left w:w="80" w:type="dxa"/>
+              <w:right w:w="80" w:type="dxa"/>
             </w:tcMar>
           </w:tcPr>
           <w:p>
@@ -718,23 +798,21 @@
               <w:rPr>
                 <w:rFonts w:ascii="Calibri" w:hAnsi="Calibri"/>
                 <w:b w:val="0"/>
-                <w:sz w:val="19"/>
+                <w:sz w:val="18"/>
               </w:rPr>
-              <w:t>2:30 – 3:30 (1 min 00s)</w:t>
+              <w:t>Part 3: Live Walkthrough</w:t>
             </w:r>
           </w:p>
         </w:tc>
-      </w:tr>
-      <w:tr>
         <w:tc>
           <w:tcPr>
-            <w:tcW w:type="dxa" w:w="2592"/>
-            <w:shd w:fill="F8FAFC"/>
+            <w:tcW w:type="dxa" w:w="2304"/>
+            <w:shd w:fill="FFFFFF"/>
             <w:tcMar>
               <w:top w:w="80" w:type="dxa"/>
               <w:bottom w:w="80" w:type="dxa"/>
-              <w:left w:w="90" w:type="dxa"/>
-              <w:right w:w="90" w:type="dxa"/>
+              <w:left w:w="80" w:type="dxa"/>
+              <w:right w:w="80" w:type="dxa"/>
             </w:tcMar>
           </w:tcPr>
           <w:p>
@@ -745,21 +823,21 @@
               <w:rPr>
                 <w:rFonts w:ascii="Calibri" w:hAnsi="Calibri"/>
                 <w:b w:val="0"/>
-                <w:sz w:val="19"/>
+                <w:sz w:val="18"/>
               </w:rPr>
-              <w:t>Part 4: Live Test Inquiries</w:t>
+              <w:t>Marcel Avergonzado</w:t>
             </w:r>
           </w:p>
         </w:tc>
         <w:tc>
           <w:tcPr>
-            <w:tcW w:type="dxa" w:w="4896"/>
-            <w:shd w:fill="F8FAFC"/>
+            <w:tcW w:type="dxa" w:w="3312"/>
+            <w:shd w:fill="FFFFFF"/>
             <w:tcMar>
               <w:top w:w="80" w:type="dxa"/>
               <w:bottom w:w="80" w:type="dxa"/>
-              <w:left w:w="90" w:type="dxa"/>
-              <w:right w:w="90" w:type="dxa"/>
+              <w:left w:w="80" w:type="dxa"/>
+              <w:right w:w="80" w:type="dxa"/>
             </w:tcMar>
           </w:tcPr>
           <w:p>
@@ -770,21 +848,21 @@
               <w:rPr>
                 <w:rFonts w:ascii="Calibri" w:hAnsi="Calibri"/>
                 <w:b w:val="0"/>
-                <w:sz w:val="19"/>
+                <w:sz w:val="18"/>
               </w:rPr>
-              <w:t>3 questions: Programs offered, Curfew rules, Out-of-scope refusal</w:t>
+              <w:t>Public Railway link, zero login, UI layout, mobile responsiveness</w:t>
             </w:r>
           </w:p>
         </w:tc>
         <w:tc>
           <w:tcPr>
-            <w:tcW w:type="dxa" w:w="1872"/>
-            <w:shd w:fill="F8FAFC"/>
+            <w:tcW w:type="dxa" w:w="1584"/>
+            <w:shd w:fill="FFFFFF"/>
             <w:tcMar>
               <w:top w:w="80" w:type="dxa"/>
               <w:bottom w:w="80" w:type="dxa"/>
-              <w:left w:w="90" w:type="dxa"/>
-              <w:right w:w="90" w:type="dxa"/>
+              <w:left w:w="80" w:type="dxa"/>
+              <w:right w:w="80" w:type="dxa"/>
             </w:tcMar>
           </w:tcPr>
           <w:p>
@@ -795,9 +873,9 @@
               <w:rPr>
                 <w:rFonts w:ascii="Calibri" w:hAnsi="Calibri"/>
                 <w:b w:val="0"/>
-                <w:sz w:val="19"/>
+                <w:sz w:val="18"/>
               </w:rPr>
-              <w:t>3:30 – 5:30 (2 min 00s)</w:t>
+              <w:t>2:45 – 3:45 (1m 00s)</w:t>
             </w:r>
           </w:p>
         </w:tc>
@@ -805,13 +883,13 @@
       <w:tr>
         <w:tc>
           <w:tcPr>
-            <w:tcW w:type="dxa" w:w="2592"/>
-            <w:shd w:fill="FFFFFF"/>
+            <w:tcW w:type="dxa" w:w="2160"/>
+            <w:shd w:fill="F8FAFC"/>
             <w:tcMar>
               <w:top w:w="80" w:type="dxa"/>
               <w:bottom w:w="80" w:type="dxa"/>
-              <w:left w:w="90" w:type="dxa"/>
-              <w:right w:w="90" w:type="dxa"/>
+              <w:left w:w="80" w:type="dxa"/>
+              <w:right w:w="80" w:type="dxa"/>
             </w:tcMar>
           </w:tcPr>
           <w:p>
@@ -822,21 +900,21 @@
               <w:rPr>
                 <w:rFonts w:ascii="Calibri" w:hAnsi="Calibri"/>
                 <w:b w:val="0"/>
-                <w:sz w:val="19"/>
+                <w:sz w:val="18"/>
               </w:rPr>
-              <w:t>Part 5: Future Improvements</w:t>
+              <w:t>Part 4: Live Test Inquiries</w:t>
             </w:r>
           </w:p>
         </w:tc>
         <w:tc>
           <w:tcPr>
-            <w:tcW w:type="dxa" w:w="4896"/>
-            <w:shd w:fill="FFFFFF"/>
+            <w:tcW w:type="dxa" w:w="2304"/>
+            <w:shd w:fill="F8FAFC"/>
             <w:tcMar>
               <w:top w:w="80" w:type="dxa"/>
               <w:bottom w:w="80" w:type="dxa"/>
-              <w:left w:w="90" w:type="dxa"/>
-              <w:right w:w="90" w:type="dxa"/>
+              <w:left w:w="80" w:type="dxa"/>
+              <w:right w:w="80" w:type="dxa"/>
             </w:tcMar>
           </w:tcPr>
           <w:p>
@@ -847,21 +925,21 @@
               <w:rPr>
                 <w:rFonts w:ascii="Calibri" w:hAnsi="Calibri"/>
                 <w:b w:val="0"/>
-                <w:sz w:val="19"/>
+                <w:sz w:val="18"/>
               </w:rPr>
-              <w:t>Multilingual (Bisaya), SIS integration, voice input, conclusion</w:t>
+              <w:t>Marcel Avergonzado</w:t>
             </w:r>
           </w:p>
         </w:tc>
         <w:tc>
           <w:tcPr>
-            <w:tcW w:type="dxa" w:w="1872"/>
-            <w:shd w:fill="FFFFFF"/>
+            <w:tcW w:type="dxa" w:w="3312"/>
+            <w:shd w:fill="F8FAFC"/>
             <w:tcMar>
               <w:top w:w="80" w:type="dxa"/>
               <w:bottom w:w="80" w:type="dxa"/>
-              <w:left w:w="90" w:type="dxa"/>
-              <w:right w:w="90" w:type="dxa"/>
+              <w:left w:w="80" w:type="dxa"/>
+              <w:right w:w="80" w:type="dxa"/>
             </w:tcMar>
           </w:tcPr>
           <w:p>
@@ -872,9 +950,136 @@
               <w:rPr>
                 <w:rFonts w:ascii="Calibri" w:hAnsi="Calibri"/>
                 <w:b w:val="0"/>
-                <w:sz w:val="19"/>
+                <w:sz w:val="18"/>
               </w:rPr>
-              <w:t>5:30 – 6:30 (1 min 00s)</w:t>
+              <w:t>3 questions: Programs offered, Curfew rules, Out-of-scope refusal</w:t>
+            </w:r>
+          </w:p>
+        </w:tc>
+        <w:tc>
+          <w:tcPr>
+            <w:tcW w:type="dxa" w:w="1584"/>
+            <w:shd w:fill="F8FAFC"/>
+            <w:tcMar>
+              <w:top w:w="80" w:type="dxa"/>
+              <w:bottom w:w="80" w:type="dxa"/>
+              <w:left w:w="80" w:type="dxa"/>
+              <w:right w:w="80" w:type="dxa"/>
+            </w:tcMar>
+          </w:tcPr>
+          <w:p>
+            <w:pPr>
+              <w:spacing w:after="0"/>
+            </w:pPr>
+            <w:r>
+              <w:rPr>
+                <w:rFonts w:ascii="Calibri" w:hAnsi="Calibri"/>
+                <w:b w:val="0"/>
+                <w:sz w:val="18"/>
+              </w:rPr>
+              <w:t>3:45 – 5:15 (1m 30s)</w:t>
+            </w:r>
+          </w:p>
+        </w:tc>
+      </w:tr>
+      <w:tr>
+        <w:tc>
+          <w:tcPr>
+            <w:tcW w:type="dxa" w:w="2160"/>
+            <w:shd w:fill="FFFFFF"/>
+            <w:tcMar>
+              <w:top w:w="80" w:type="dxa"/>
+              <w:bottom w:w="80" w:type="dxa"/>
+              <w:left w:w="80" w:type="dxa"/>
+              <w:right w:w="80" w:type="dxa"/>
+            </w:tcMar>
+          </w:tcPr>
+          <w:p>
+            <w:pPr>
+              <w:spacing w:after="0"/>
+            </w:pPr>
+            <w:r>
+              <w:rPr>
+                <w:rFonts w:ascii="Calibri" w:hAnsi="Calibri"/>
+                <w:b w:val="0"/>
+                <w:sz w:val="18"/>
+              </w:rPr>
+              <w:t>Part 5: Improvements &amp; Close</w:t>
+            </w:r>
+          </w:p>
+        </w:tc>
+        <w:tc>
+          <w:tcPr>
+            <w:tcW w:type="dxa" w:w="2304"/>
+            <w:shd w:fill="FFFFFF"/>
+            <w:tcMar>
+              <w:top w:w="80" w:type="dxa"/>
+              <w:bottom w:w="80" w:type="dxa"/>
+              <w:left w:w="80" w:type="dxa"/>
+              <w:right w:w="80" w:type="dxa"/>
+            </w:tcMar>
+          </w:tcPr>
+          <w:p>
+            <w:pPr>
+              <w:spacing w:after="0"/>
+            </w:pPr>
+            <w:r>
+              <w:rPr>
+                <w:rFonts w:ascii="Calibri" w:hAnsi="Calibri"/>
+                <w:b w:val="0"/>
+                <w:sz w:val="18"/>
+              </w:rPr>
+              <w:t>Ronald M. Barril</w:t>
+            </w:r>
+          </w:p>
+        </w:tc>
+        <w:tc>
+          <w:tcPr>
+            <w:tcW w:type="dxa" w:w="3312"/>
+            <w:shd w:fill="FFFFFF"/>
+            <w:tcMar>
+              <w:top w:w="80" w:type="dxa"/>
+              <w:bottom w:w="80" w:type="dxa"/>
+              <w:left w:w="80" w:type="dxa"/>
+              <w:right w:w="80" w:type="dxa"/>
+            </w:tcMar>
+          </w:tcPr>
+          <w:p>
+            <w:pPr>
+              <w:spacing w:after="0"/>
+            </w:pPr>
+            <w:r>
+              <w:rPr>
+                <w:rFonts w:ascii="Calibri" w:hAnsi="Calibri"/>
+                <w:b w:val="0"/>
+                <w:sz w:val="18"/>
+              </w:rPr>
+              <w:t>Multilingual (Bisaya), SIS integration, voice input, conclusion</w:t>
+            </w:r>
+          </w:p>
+        </w:tc>
+        <w:tc>
+          <w:tcPr>
+            <w:tcW w:type="dxa" w:w="1584"/>
+            <w:shd w:fill="FFFFFF"/>
+            <w:tcMar>
+              <w:top w:w="80" w:type="dxa"/>
+              <w:bottom w:w="80" w:type="dxa"/>
+              <w:left w:w="80" w:type="dxa"/>
+              <w:right w:w="80" w:type="dxa"/>
+            </w:tcMar>
+          </w:tcPr>
+          <w:p>
+            <w:pPr>
+              <w:spacing w:after="0"/>
+            </w:pPr>
+            <w:r>
+              <w:rPr>
+                <w:rFonts w:ascii="Calibri" w:hAnsi="Calibri"/>
+                <w:b w:val="0"/>
+                <w:sz w:val="18"/>
+              </w:rPr>
+              <w:t>5:15 – 6:30 (1m 15s)</w:t>
             </w:r>
           </w:p>
         </w:tc>
@@ -894,7 +1099,20 @@
           <w:rFonts w:ascii="Calibri" w:hAnsi="Calibri"/>
           <w:color w:val="064E3B"/>
         </w:rPr>
-        <w:t>Part 1: The Problem &amp; Knowledge Sources Used (0:00 – 1:15)</w:t>
+        <w:t>Part 1: The Problem &amp; Knowledge Sources Used (0:00 – 1:30)</w:t>
+      </w:r>
+    </w:p>
+    <w:p>
+      <w:pPr>
+        <w:spacing w:after="80"/>
+      </w:pPr>
+      <w:r>
+        <w:rPr>
+          <w:rFonts w:ascii="Calibri" w:hAnsi="Calibri"/>
+          <w:b/>
+          <w:color w:val="064E3B"/>
+        </w:rPr>
+        <w:t>🎙️ ASSIGNED PRESENTER: EDUARDO AVENIDO JR.</w:t>
       </w:r>
     </w:p>
     <w:tbl>
@@ -936,7 +1154,7 @@
                 <w:color w:val="0F172A"/>
                 <w:sz w:val="20"/>
               </w:rPr>
-              <w:t>🎥 SCREEN ACTION: Record screen showing the opening title slide, or camera with the speaker on screen, then transition to displaying the official documents folder (TPC Student Handbook v.04, Talibon Ordinance 127, etc.).</w:t>
+              <w:t>🎥 SCREEN ACTION: Record screen showing the opening title slide with Team Kuys member names, or camera with Eduardo Avenido Jr. on screen. Transition to displaying the official documents folder (TPC Student Handbook v.04, Talibon Ordinance 127, etc.).</w:t>
             </w:r>
           </w:p>
         </w:tc>
@@ -956,30 +1174,33 @@
           <w:b/>
           <w:color w:val="059669"/>
         </w:rPr>
-        <w:t>🎙️ PRESENTER SCRIPT:</w:t>
+        <w:t>SPEAKING SCRIPT:</w:t>
         <w:br/>
       </w:r>
       <w:r>
         <w:rPr>
           <w:sz w:val="22"/>
         </w:rPr>
-        <w:t>"Good day, instructor and classmates! Today, we are proud to present our Generative AI capstone project: TPoliCynav — The TPC Policy Navigator. We are Team Kuys, composed of Eduardo Avenido Jr., Christian Paul Larosa, Nielbert Garcia, and Marcel Avergonzado.</w:t>
+        <w:t>"Good day, instructor and classmates! Welcome to our Generative AI capstone presentation. We are Team Kuys from Talibon Polytechnic College in Bohol, composed of myself, Eduardo Avenido Jr., Christian Paul G. La Rosa — who is our lead AI developer and the creator of this entire project — along with Nielbert Garcia, Marcel Avergonzado, and Ronald M. Barril.</w:t>
+        <w:br/>
+        <w:br/>
+        <w:t>Today, we are presenting TPoliCynav: The TPC Policy Navigator.</w:t>
         <w:br/>
         <w:br/>
         <w:t>Let’s begin with the problem we set out to solve:</w:t>
         <w:br/>
         <w:br/>
-        <w:t>At Talibon Polytechnic College in Bohol, thousands of students regularly have critical questions about college guidelines — from freshman admission criteria and retention GWA, to examination dress codes, municipal boarding house curfews, and CHED scholarship subsidies. However, these rules are scattered across thick 200-page printed PDF handbooks and municipal ordinances. Students often rely on word-of-mouth rumors, or face long queues at the Registrar and Student Affairs offices.</w:t>
+        <w:t>At Talibon Polytechnic College, thousands of students regularly have critical questions regarding institutional guidelines — from freshman admission criteria and retention GWA, to examination dress codes, municipal boarding house curfews, and CHED scholarship subsidies. However, these rules are scattered across thick 200-page printed PDF handbooks and municipal ordinances. Students often rely on word-of-mouth rumors, or face long queues at the Registrar and Student Affairs offices.</w:t>
         <w:br/>
         <w:br/>
-        <w:t>To solve this, we built TPoliCynav: a specialized, retrieval-augmented conversational agent that delivers authoritative, instant, and verified answers grounded exclusively in official institutional records.</w:t>
+        <w:t>To solve this, our group developed TPoliCynav: a specialized, retrieval-augmented conversational agent that delivers authoritative, instant, and verified answers grounded exclusively in official institutional records.</w:t>
         <w:br/>
         <w:br/>
         <w:t>Our knowledge base is built from 7 verified college sources:</w:t>
         <w:br/>
         <w:t>1. The latest 202-page approved TPC Student Handbook Version 04;</w:t>
         <w:br/>
-        <w:t>2. Talibon Municipal Ordinance Number 127 regarding boarding house safety and 10:00 PM curfews;</w:t>
+        <w:t>2. Talibon Municipal Ordinance Number 127 regarding boarding house safety standards and 10:00 PM curfews;</w:t>
         <w:br/>
         <w:t>3. The official TPC Uniform and Grooming Standards Guide;</w:t>
         <w:br/>
@@ -989,7 +1210,10 @@
         <w:br/>
         <w:t>6. GSIS STEM Scholarship Subsidy maintainability rules; and</w:t>
         <w:br/>
-        <w:t>7. Joint PNP-TPC Campus Safety and Curfew Inspection Memorandums."</w:t>
+        <w:t>7. Joint PNP-TPC Campus Safety and Curfew Inspection Memorandums.</w:t>
+        <w:br/>
+        <w:br/>
+        <w:t>Now, I will pass the floor over to Nielbert Garcia to explain the technical architecture and RAG pipeline powering TPoliCynav."</w:t>
       </w:r>
     </w:p>
     <w:p>
@@ -1001,7 +1225,20 @@
           <w:rFonts w:ascii="Calibri" w:hAnsi="Calibri"/>
           <w:color w:val="064E3B"/>
         </w:rPr>
-        <w:t>Part 2: Technical Architecture &amp; RAG Pipeline (1:15 – 2:30)</w:t>
+        <w:t>Part 2: Technical Architecture &amp; RAG Pipeline (1:30 – 2:45)</w:t>
+      </w:r>
+    </w:p>
+    <w:p>
+      <w:pPr>
+        <w:spacing w:after="80"/>
+      </w:pPr>
+      <w:r>
+        <w:rPr>
+          <w:rFonts w:ascii="Calibri" w:hAnsi="Calibri"/>
+          <w:b/>
+          <w:color w:val="064E3B"/>
+        </w:rPr>
+        <w:t>🎙️ ASSIGNED PRESENTER: NIELBERT GARCIA</w:t>
       </w:r>
     </w:p>
     <w:tbl>
@@ -1043,7 +1280,7 @@
                 <w:color w:val="0F172A"/>
                 <w:sz w:val="20"/>
               </w:rPr>
-              <w:t>🎥 SCREEN ACTION: Display the 'About the Chatbot &amp; Architecture' tab on the live website, or a clean architecture diagram slide showing the flow: PDF Documents -&gt; Chunking -&gt; BGE-Small -&gt; Pinecone Vector Store -&gt; Cosine Guardrail -&gt; LLM -&gt; Streamlit UI.</w:t>
+              <w:t>🎥 SCREEN ACTION: Display the 'About the Chatbot &amp; Architecture' tab on the live website, or a clean architecture diagram slide showing the flow: PDF Documents -&gt; Chunking -&gt; BGE-Small -&gt; Pinecone Vector Store -&gt; 0.50 Cosine Guardrail -&gt; LLM -&gt; Streamlit UI.</w:t>
             </w:r>
           </w:p>
         </w:tc>
@@ -1063,14 +1300,14 @@
           <w:b/>
           <w:color w:val="059669"/>
         </w:rPr>
-        <w:t>🎙️ PRESENTER SCRIPT:</w:t>
+        <w:t>SPEAKING SCRIPT:</w:t>
         <w:br/>
       </w:r>
       <w:r>
         <w:rPr>
           <w:sz w:val="22"/>
         </w:rPr>
-        <w:t>"Now let’s look under the hood at the technical architecture powering TPoliCynav.</w:t>
+        <w:t>"Thank you, Eduardo! Good day everyone, I am Nielbert Garcia, and I will walk you through the technical architecture powering TPoliCynav.</w:t>
         <w:br/>
         <w:br/>
         <w:t>We designed a production-grade, zero-hallucination RAG pipeline following these five technical pillars:</w:t>
@@ -1091,7 +1328,10 @@
         <w:t>5. Orchestration &amp; Conversational Memory: We used LangChain with a 5-turn sliding window memory buffer. This allows students to ask natural follow-up questions — like saying "What about shoes?" after asking about uniforms — and the model resolves the context accurately.</w:t>
         <w:br/>
         <w:br/>
-        <w:t>6. Deployment &amp; Hosting: The application is containerized with Docker and continuously deployed on Railway Cloud via GitHub CI/CD, running 24/7 on a public link without requiring any login."</w:t>
+        <w:t>6. Deployment &amp; Hosting: The application is containerized with Docker and continuously deployed on Railway Cloud via GitHub CI/CD, running 24/7 on a public link without requiring any login.</w:t>
+        <w:br/>
+        <w:br/>
+        <w:t>Now, I will turn the presentation over to Marcel Avergonzado for a live walkthrough of our deployed app and sample test questions."</w:t>
       </w:r>
     </w:p>
     <w:p>
@@ -1103,7 +1343,20 @@
           <w:rFonts w:ascii="Calibri" w:hAnsi="Calibri"/>
           <w:color w:val="064E3B"/>
         </w:rPr>
-        <w:t>Part 3: Live Walkthrough of the Public Deployed App (2:30 – 3:30)</w:t>
+        <w:t>Part 3: Live Walkthrough of the Public Deployed App (2:45 – 3:45)</w:t>
+      </w:r>
+    </w:p>
+    <w:p>
+      <w:pPr>
+        <w:spacing w:after="80"/>
+      </w:pPr>
+      <w:r>
+        <w:rPr>
+          <w:rFonts w:ascii="Calibri" w:hAnsi="Calibri"/>
+          <w:b/>
+          <w:color w:val="064E3B"/>
+        </w:rPr>
+        <w:t>🎙️ ASSIGNED PRESENTER: MARCEL AVERGONZADO</w:t>
       </w:r>
     </w:p>
     <w:tbl>
@@ -1165,17 +1418,17 @@
           <w:b/>
           <w:color w:val="059669"/>
         </w:rPr>
-        <w:t>🎙️ PRESENTER SCRIPT:</w:t>
+        <w:t>SPEAKING SCRIPT:</w:t>
         <w:br/>
       </w:r>
       <w:r>
         <w:rPr>
           <w:sz w:val="22"/>
         </w:rPr>
-        <w:t>"Next, let’s demonstrate the live, publicly deployed application.</w:t>
+        <w:t>"Thank you, Nielbert! Hello everyone, I am Marcel Avergonzado, and I will be demonstrating the live, publicly deployed application.</w:t>
         <w:br/>
         <w:br/>
-        <w:t>As you can see on screen, our app is hosted live on Railway at tpolicynav-production.up.railway.app. Following the project requirements, anyone can open this link on their laptop or smartphone without creating an account or logging in.</w:t>
+        <w:t>As you can see on my screen, our app is hosted live on Railway at tpolicynav-production.up.railway.app. Meeting the project rubric 100%, anyone can open this link on their laptop, tablet, or smartphone without installing anything or creating an account.</w:t>
         <w:br/>
         <w:br/>
         <w:t>Let’s take a quick tour of the user interface:</w:t>
@@ -1200,21 +1453,20 @@
           <w:rFonts w:ascii="Calibri" w:hAnsi="Calibri"/>
           <w:color w:val="064E3B"/>
         </w:rPr>
-        <w:t>Part 4: Live Test Inquiries — 3 Sample Questions (3:30 – 5:30)</w:t>
+        <w:t>Part 4: Live Test Inquiries — 3 Sample Questions (3:45 – 5:15)</w:t>
       </w:r>
     </w:p>
     <w:p>
       <w:pPr>
-        <w:spacing w:after="120"/>
+        <w:spacing w:after="80"/>
       </w:pPr>
       <w:r>
         <w:rPr>
           <w:rFonts w:ascii="Calibri" w:hAnsi="Calibri"/>
           <w:b/>
-          <w:i/>
-          <w:color w:val="059669"/>
+          <w:color w:val="064E3B"/>
         </w:rPr>
-        <w:t>Important Rubric Requirement: Demonstrate at least 3 live questions, including at least one question that the documents CANNOT answer to prove the guardrails work without hallucinations.</w:t>
+        <w:t>🎙️ ASSIGNED PRESENTER: MARCEL AVERGONZADO (CONTINUED)</w:t>
       </w:r>
     </w:p>
     <w:tbl>
@@ -1275,7 +1527,7 @@
         <w:rPr>
           <w:b/>
         </w:rPr>
-        <w:t>🎙️ PRESENTER SCRIPT (Sample Question 1 — Academic Scope):</w:t>
+        <w:t>SPEAKING SCRIPT (Sample Question 1 — Academic Scope):</w:t>
         <w:br/>
       </w:r>
       <w:r>
@@ -1361,7 +1613,7 @@
         <w:rPr>
           <w:b/>
         </w:rPr>
-        <w:t>🎙️ PRESENTER SCRIPT (Sample Question 2 — Community &amp; Municipal Policy):</w:t>
+        <w:t>SPEAKING SCRIPT (Sample Question 2 — Community &amp; Municipal Policy):</w:t>
         <w:br/>
       </w:r>
       <w:r>
@@ -1440,7 +1692,7 @@
         <w:rPr>
           <w:b/>
         </w:rPr>
-        <w:t>🎙️ PRESENTER SCRIPT (Sample Question 3 — Out-of-Scope Refusal Guardrail):</w:t>
+        <w:t>SPEAKING SCRIPT (Sample Question 3 — Out-of-Scope Refusal Guardrail):</w:t>
         <w:br/>
       </w:r>
       <w:r>
@@ -1460,7 +1712,10 @@
         <w:t>Notice the result! The chatbot does NOT hallucinate or pretend to know. Because Tokyo’s population is not in the TPC policy corpus, the cosine similarity score fell below our 0.50 threshold. Our guardrail intercepted the request and safely responded: "I apologize, but this topic is outside the official scope of Talibon Polytechnic College institutional policies. For college-related inquiries, please consult the Registrar or Office of Student Affairs."</w:t>
         <w:br/>
         <w:br/>
-        <w:t>This proves our RAG pipeline has strict containment and will never mislead students with fabricated answers."</w:t>
+        <w:t>This proves our RAG pipeline has strict containment and will never mislead students with fabricated answers.</w:t>
+        <w:br/>
+        <w:br/>
+        <w:t>Now, I will pass the microphone to Ronald M. Barril to discuss our planned future improvements and conclude our presentation."</w:t>
       </w:r>
     </w:p>
     <w:p>
@@ -1472,7 +1727,20 @@
           <w:rFonts w:ascii="Calibri" w:hAnsi="Calibri"/>
           <w:color w:val="064E3B"/>
         </w:rPr>
-        <w:t>Part 5: What We Would Improve &amp; Conclusion (5:30 – 6:30)</w:t>
+        <w:t>Part 5: What We Would Improve &amp; Conclusion (5:15 – 6:30)</w:t>
+      </w:r>
+    </w:p>
+    <w:p>
+      <w:pPr>
+        <w:spacing w:after="80"/>
+      </w:pPr>
+      <w:r>
+        <w:rPr>
+          <w:rFonts w:ascii="Calibri" w:hAnsi="Calibri"/>
+          <w:b/>
+          <w:color w:val="064E3B"/>
+        </w:rPr>
+        <w:t>🎙️ ASSIGNED PRESENTER: RONALD M. BARRIL</w:t>
       </w:r>
     </w:p>
     <w:tbl>
@@ -1533,20 +1801,23 @@
         <w:rPr>
           <w:b/>
         </w:rPr>
-        <w:t>🎙️ PRESENTER SCRIPT:</w:t>
+        <w:t>SPEAKING SCRIPT:</w:t>
         <w:br/>
       </w:r>
       <w:r>
         <w:rPr>
           <w:sz w:val="22"/>
         </w:rPr>
-        <w:t>"To conclude our presentation, here are the four concrete improvements we would implement in future versions of TPoliCynav:</w:t>
+        <w:t>"Thank you, Marcel! Good day everyone, I am Ronald M. Barril, and I will present our roadmap for future improvements and conclude our presentation.</w:t>
         <w:br/>
         <w:br/>
-        <w:t>1. Vernacular Language Support (Cebuano / Bisaya): While our current model handles English and Tagalog well, many students in Bohol express complex policy questions naturally in Bisaya. Adding bilingual embeddings will further increase accessibility.</w:t>
+        <w:t>While TPoliCynav successfully resolves the core challenges of institutional policy retrieval, here are the four concrete improvements we would implement in future versions:</w:t>
         <w:br/>
         <w:br/>
-        <w:t>2. Voice-to-Text &amp; Audio Accessibility: Integrating speech-to-text models like Whisper so visually impaired students or users on the go can speak their policy questions and listen to audio answers.</w:t>
+        <w:t>1. Vernacular Language Support (Cebuano / Bisaya): While our current model handles English and Tagalog well, many students in Bohol express complex policy inquiries naturally in Bisaya. Adding bilingual embeddings will further increase accessibility.</w:t>
+        <w:br/>
+        <w:br/>
+        <w:t>2. Voice-to-Text &amp; Audio Accessibility: Integrating speech-to-text models like Whisper so visually impaired students or users on mobile devices can speak their policy questions and listen to synthesized audio answers.</w:t>
         <w:br/>
         <w:br/>
         <w:t>3. Direct Student Information System (SIS) Integration: Connecting the chatbot securely to student clearance databases so enrolled students can authenticate to check personalized items, such as graduation clearances and remaining scholarship balances.</w:t>
@@ -1558,7 +1829,7 @@
         <w:t>All source code, Docker configs, documentation, and the .env.example are publicly available in our GitHub repository at github.com/hackjas1/TPoliCyNav.</w:t>
         <w:br/>
         <w:br/>
-        <w:t>On behalf of Team Kuys — Eduardo, Christian Paul, Nielbert, and Marcel — thank you very much for your time and guidance throughout our Generative AI course! We are now open for any questions."</w:t>
+        <w:t>On behalf of Team Kuys — Eduardo Avenido Jr., Christian Paul G. La Rosa, Nielbert Garcia, Marcel Avergonzado, and myself, Ronald M. Barril — thank you very much for your time and guidance throughout our Generative AI course! We are now open for any questions."</w:t>
       </w:r>
     </w:p>
     <w:p>
@@ -1783,6 +2054,112 @@
                 <w:sz w:val="19"/>
               </w:rPr>
               <w:t>Covered in order: 1) Problem &amp; Data, 2) Architecture, 3) Walkthrough, 4) 3 Inquiries, 5) Improvements.</w:t>
+            </w:r>
+          </w:p>
+        </w:tc>
+      </w:tr>
+      <w:tr>
+        <w:tc>
+          <w:tcPr>
+            <w:tcW w:type="dxa" w:w="3168"/>
+            <w:shd w:fill="F8FAFC"/>
+            <w:tcMar>
+              <w:top w:w="70" w:type="dxa"/>
+              <w:bottom w:w="70" w:type="dxa"/>
+              <w:left w:w="90" w:type="dxa"/>
+              <w:right w:w="90" w:type="dxa"/>
+            </w:tcMar>
+          </w:tcPr>
+          <w:p>
+            <w:pPr>
+              <w:spacing w:after="0"/>
+            </w:pPr>
+            <w:r>
+              <w:rPr>
+                <w:rFonts w:ascii="Calibri" w:hAnsi="Calibri"/>
+                <w:b/>
+                <w:color w:val="064E3B"/>
+                <w:sz w:val="19"/>
+              </w:rPr>
+              <w:t>☐ Speaker Rotation</w:t>
+            </w:r>
+          </w:p>
+        </w:tc>
+        <w:tc>
+          <w:tcPr>
+            <w:tcW w:type="dxa" w:w="6192"/>
+            <w:shd w:fill="F8FAFC"/>
+            <w:tcMar>
+              <w:top w:w="70" w:type="dxa"/>
+              <w:bottom w:w="70" w:type="dxa"/>
+              <w:left w:w="90" w:type="dxa"/>
+              <w:right w:w="90" w:type="dxa"/>
+            </w:tcMar>
+          </w:tcPr>
+          <w:p>
+            <w:pPr>
+              <w:spacing w:after="0"/>
+            </w:pPr>
+            <w:r>
+              <w:rPr>
+                <w:rFonts w:ascii="Calibri" w:hAnsi="Calibri"/>
+                <w:color w:val="0F172A"/>
+                <w:sz w:val="19"/>
+              </w:rPr>
+              <w:t>1. Eduardo Avenido Jr.  |  2. Nielbert Garcia  |  3. Marcel Avergonzado  |  4. Ronald M. Barril.</w:t>
+            </w:r>
+          </w:p>
+        </w:tc>
+      </w:tr>
+      <w:tr>
+        <w:tc>
+          <w:tcPr>
+            <w:tcW w:type="dxa" w:w="3168"/>
+            <w:shd w:fill="FFFFFF"/>
+            <w:tcMar>
+              <w:top w:w="70" w:type="dxa"/>
+              <w:bottom w:w="70" w:type="dxa"/>
+              <w:left w:w="90" w:type="dxa"/>
+              <w:right w:w="90" w:type="dxa"/>
+            </w:tcMar>
+          </w:tcPr>
+          <w:p>
+            <w:pPr>
+              <w:spacing w:after="0"/>
+            </w:pPr>
+            <w:r>
+              <w:rPr>
+                <w:rFonts w:ascii="Calibri" w:hAnsi="Calibri"/>
+                <w:b/>
+                <w:color w:val="064E3B"/>
+                <w:sz w:val="19"/>
+              </w:rPr>
+              <w:t>☐ Creator Credit</w:t>
+            </w:r>
+          </w:p>
+        </w:tc>
+        <w:tc>
+          <w:tcPr>
+            <w:tcW w:type="dxa" w:w="6192"/>
+            <w:shd w:fill="FFFFFF"/>
+            <w:tcMar>
+              <w:top w:w="70" w:type="dxa"/>
+              <w:bottom w:w="70" w:type="dxa"/>
+              <w:left w:w="90" w:type="dxa"/>
+              <w:right w:w="90" w:type="dxa"/>
+            </w:tcMar>
+          </w:tcPr>
+          <w:p>
+            <w:pPr>
+              <w:spacing w:after="0"/>
+            </w:pPr>
+            <w:r>
+              <w:rPr>
+                <w:rFonts w:ascii="Calibri" w:hAnsi="Calibri"/>
+                <w:color w:val="0F172A"/>
+                <w:sz w:val="19"/>
+              </w:rPr>
+              <w:t>Christian Paul G. La Rosa credited in group roster as lead creator and system architect.</w:t>
             </w:r>
           </w:p>
         </w:tc>

</xml_diff>

<commit_message>
docs(script): update presentation script DOCX with multi-layer 0.60 guardrails and zero-hallucination defense
</commit_message>
<xml_diff>
--- a/TPoliCynav_Final_Presentation_Script.docx
+++ b/TPoliCynav_Final_Presentation_Script.docx
@@ -748,7 +748,7 @@
                 <w:b w:val="0"/>
                 <w:sz w:val="18"/>
               </w:rPr>
-              <w:t>BGE-Small embedding, Pinecone vector store, 0.50 guardrail, LangChain</w:t>
+              <w:t>BGE-Small embedding, Pinecone vector store, Multi-Layer 0.60 Guardrail, LangChain</w:t>
             </w:r>
           </w:p>
         </w:tc>
@@ -952,7 +952,7 @@
                 <w:b w:val="0"/>
                 <w:sz w:val="18"/>
               </w:rPr>
-              <w:t>3 questions: Programs offered, Curfew rules, Out-of-scope refusal</w:t>
+              <w:t>3 questions: Programs offered, Curfew rules, Multi-Layer Out-of-Scope refusal</w:t>
             </w:r>
           </w:p>
         </w:tc>
@@ -1280,7 +1280,7 @@
                 <w:color w:val="0F172A"/>
                 <w:sz w:val="20"/>
               </w:rPr>
-              <w:t>🎥 SCREEN ACTION: Display the 'About the Chatbot &amp; Architecture' tab on the live website, or a clean architecture diagram slide showing the flow: PDF Documents -&gt; Chunking -&gt; BGE-Small -&gt; Pinecone Vector Store -&gt; 0.50 Cosine Guardrail -&gt; LLM -&gt; Streamlit UI.</w:t>
+              <w:t>🎥 SCREEN ACTION: Display the 'About the Chatbot &amp; Architecture' tab on the live website, or a clean architecture diagram slide showing the flow: PDF Documents -&gt; Chunking -&gt; BGE-Small -&gt; Pinecone Vector Store -&gt; Multi-Layer Guardrails (0.60 Cosine + Lexical Verification) -&gt; LLM -&gt; Streamlit UI.</w:t>
             </w:r>
           </w:p>
         </w:tc>
@@ -1322,10 +1322,10 @@
         <w:t>3. Vector Database &amp; Storage: We implemented a hybrid architecture. In the cloud, we use Pinecone Serverless deployed in AWS us-east-1 for lightning-fast sub-50-millisecond cosine vector searches. As a resilience backup, our system includes an automatic local NumPy dense matrix fallback so the chatbot never goes down even during cloud network blips.</w:t>
         <w:br/>
         <w:br/>
-        <w:t>4. Scope Containment Guardrail (Strict 0.50 Cosine Threshold): This is our most critical guardrail against hallucinations. Before any LLM generates an answer, we evaluate the cosine similarity of the retrieved passages. If the highest score is below 0.50, the system safely refuses to answer and redirects the student to the Registrar or OSAS, guaranteeing zero false policy advice.</w:t>
+        <w:t>4. Multi-Layer Scope Containment &amp; Anti-Hallucination Guardrails: This is our most critical defense against AI hallucinations. Dense embeddings naturally exhibit an ambient similarity floor around 0.45 to 0.55 for general English sentences. To prevent off-topic hallucinations, we raised our threshold to 0.60 and implemented a three-tier defense: First, an instant intent classifier that blocks programming tasks, math homework, and general trivia; Second, our strict 0.60 cosine vector threshold; and Third, a substantive lexical alignment check that guarantees retrieved policy chunks actually discuss the student’s specific inquiry before extracting. If a question is off-topic, the system safely refuses and redirects the student to the Registrar or OSAS, guaranteeing zero false policy advice.</w:t>
         <w:br/>
         <w:br/>
-        <w:t>5. Orchestration &amp; Conversational Memory: We used LangChain with a 5-turn sliding window memory buffer. This allows students to ask natural follow-up questions — like saying "What about shoes?" after asking about uniforms — and the model resolves the context accurately.</w:t>
+        <w:t>5. Orchestration &amp; Conversational Memory: We used LangChain with a 5-turn sliding window memory buffer. This allows students to ask natural follow-up questions — like saying "What about shoes?" after asking about uniforms — and the model resolves the context accurately without bleeding context into unrelated turns.</w:t>
         <w:br/>
         <w:br/>
         <w:t>6. Deployment &amp; Hosting: The application is containerized with Docker and continuously deployed on Railway Cloud via GitHub CI/CD, running 24/7 on a public link without requiring any login.</w:t>
@@ -1673,7 +1673,7 @@
                 <w:color w:val="0F172A"/>
                 <w:sz w:val="20"/>
               </w:rPr>
-              <w:t>🎥 SCREEN ACTION: Click the sidebar button '🔴 Out-of-Scope Test (Refusal Guardrail)' or type: 'What is the capital city and total population of Tokyo, Japan?' Highlight the polite refusal message and notice that it refuses without hallucinating.</w:t>
+              <w:t>🎥 SCREEN ACTION: Click the sidebar button '🔴 Out-of-Scope Test (Refusal Guardrail)' or type: 'What is the capital city and total population of Tokyo, Japan?' Highlight the official Institutional Scope Notice that refuses cleanly without hallucinating. Mention that asking for coding, math, or jokes is also cleanly intercepted.</w:t>
             </w:r>
           </w:p>
         </w:tc>
@@ -1692,7 +1692,7 @@
         <w:rPr>
           <w:b/>
         </w:rPr>
-        <w:t>SPEAKING SCRIPT (Sample Question 3 — Out-of-Scope Refusal Guardrail):</w:t>
+        <w:t>SPEAKING SCRIPT (Sample Question 3 — Multi-Layer Out-of-Scope Refusal Guardrail):</w:t>
         <w:br/>
       </w:r>
       <w:r>
@@ -1709,10 +1709,10 @@
         <w:t>[Wait for output]</w:t>
         <w:br/>
         <w:br/>
-        <w:t>Notice the result! The chatbot does NOT hallucinate or pretend to know. Because Tokyo’s population is not in the TPC policy corpus, the cosine similarity score fell below our 0.50 threshold. Our guardrail intercepted the request and safely responded: "I apologize, but this topic is outside the official scope of Talibon Polytechnic College institutional policies. For college-related inquiries, please consult the Registrar or Office of Student Affairs."</w:t>
+        <w:t>Notice the result! The chatbot does NOT hallucinate or pretend to know. Because Tokyo’s population is not in the TPC policy corpus, our multi-layer guardrail intercepted the request immediately. It displays an official Institutional Scope Notice explaining that the inquiry falls outside authorized TPC publications, and clearly guides students on verified topics they can ask about — such as admissions, uniform dress codes, curfew hours, and scholarships.</w:t>
         <w:br/>
         <w:br/>
-        <w:t>This proves our RAG pipeline has strict containment and will never mislead students with fabricated answers.</w:t>
+        <w:t>Even if a user asks to write Python code, solve math equations, or tell jokes, our pre-retrieval intent classifier and calibrated 0.60 threshold ensure zero false advice and zero hallucinations.</w:t>
         <w:br/>
         <w:br/>
         <w:t>Now, I will pass the microphone to Ronald M. Barril to discuss our planned future improvements and conclude our presentation."</w:t>

</xml_diff>